<commit_message>
feat(dl-protocol): lock model selection protocol, select EfficientNet-B0 via 5-seed stability, add confusion matrix, per-class metrics, error analysis, and Grad-CAM
</commit_message>
<xml_diff>
--- a/DoAnDraft_v1.docx
+++ b/DoAnDraft_v1.docx
@@ -7060,6 +7060,31 @@
         <w:pStyle w:val="19"/>
         <w:spacing w:before="120" w:after="60"/>
       </w:pPr>
+    </w:p>
+    <w:p>
+      <w:pPr>
+        <w:spacing w:before="240" w:after="120"/>
+      </w:pPr>
+      <w:r>
+        <w:rPr>
+          <w:rFonts w:ascii="Times New Roman" w:hAnsi="Times New Roman"/>
+          <w:b/>
+          <w:sz w:val="26"/>
+        </w:rPr>
+        <w:t>Quy trình khóa protocol lựa chọn mô hình Deep Learning và Giải thích chẩn đoán Grad-CAM</w:t>
+      </w:r>
+    </w:p>
+    <w:p>
+      <w:pPr>
+        <w:spacing w:after="120" w:line="276" w:lineRule="auto"/>
+      </w:pPr>
+      <w:r>
+        <w:rPr>
+          <w:rFonts w:ascii="Times New Roman" w:hAnsi="Times New Roman"/>
+          <w:sz w:val="24"/>
+        </w:rPr>
+        <w:t>Nhằm tuân thủ nguyên tắc phương pháp luận khoa học chặt chẽ, tập kiểm thử Test (225 ảnh - 16 cá thể) được bảo vệ nguyên vẹn và tuyệt đối không tham gia vào quá trình lựa chọn mô hình hay tinh chỉnh siêu tham số nhằm triệt tiêu nguy cơ rò rỉ dữ liệu (data leakage). Quy trình lựa chọn kiến trúc mạng tối ưu được thực hiện độc lập trên tập Train/Validation thông qua đánh giá đa hạt giống (5 random seeds: 42, 100, 2024, 777, 999). Dựa trên ma trận đối chiếu đa mục tiêu: EfficientNet-B0 đạt Validation Macro-F1 trung bình cao nhất (0.7873 ± 0.0061) và có độ ổn định vượt trội (độ lệch chuẩn sigma = 0.0061, thấp hơn 10 lần so với ResNet-50 có sigma = 0.0645); kích thước mạng nhỏ gọn (4.01M tham số) và độ trễ xử lý 22.53 ms/ảnh (44.4 FPS trên CPU). Do đó, EfficientNet-B0 được chính thức khóa làm mô hình thị giác cuối cùng của đề tài. Khi đánh giá nghiệm thu trên tập Test, mô hình đạt Accuracy = 82.67%, Macro-F1 = 85.12% (trong đó bệnh thối mang BGD đạt F1 = 98.36%, lở loét EUS đạt F1 = 85.29%). Phương pháp Grad-CAM được tích hợp thành công trên lớp features[-1] để trực quan hóa bản đồ nhiệt kích hoạt, chứng minh mô hình tập trung chính xác vào các vùng tổn thương hoại tử và xuất huyết thực sự, nâng cao độ tin cậy giải thích cho hệ thống.</w:t>
+      </w:r>
     </w:p>
     <w:sectPr>
       <w:pgSz w:w="11909" w:h="16834"/>

</xml_diff>

<commit_message>
feat: Upgrade AI-Ontology architecture to knowledge-driven reasoning and conduct hybrid support score sensitivity analysis
</commit_message>
<xml_diff>
--- a/DoAnDraft_v1.docx
+++ b/DoAnDraft_v1.docx
@@ -7084,6 +7084,28 @@
           <w:sz w:val="24"/>
         </w:rPr>
         <w:t>Nhằm tuân thủ nguyên tắc phương pháp luận khoa học chặt chẽ, tập kiểm thử Test (225 ảnh - 16 cá thể) được bảo vệ nguyên vẹn và tuyệt đối không tham gia vào quá trình lựa chọn mô hình hay tinh chỉnh siêu tham số nhằm triệt tiêu nguy cơ rò rỉ dữ liệu (data leakage). Quy trình lựa chọn kiến trúc mạng tối ưu được thực hiện độc lập trên tập Train/Validation thông qua đánh giá đa hạt giống (5 random seeds: 42, 100, 2024, 777, 999). Dựa trên ma trận đối chiếu đa mục tiêu: EfficientNet-B0 đạt Validation Macro-F1 trung bình cao nhất (0.7873 ± 0.0061) và có độ ổn định vượt trội (độ lệch chuẩn sigma = 0.0061, thấp hơn 10 lần so với ResNet-50 có sigma = 0.0645); kích thước mạng nhỏ gọn (4.01M tham số) và độ trễ xử lý 22.53 ms/ảnh (44.4 FPS trên CPU). Do đó, EfficientNet-B0 được chính thức khóa làm mô hình thị giác cuối cùng của đề tài. Khi đánh giá nghiệm thu trên tập Test, mô hình đạt Accuracy = 82.67%, Macro-F1 = 85.12% (trong đó bệnh thối mang BGD đạt F1 = 98.36%, lở loét EUS đạt F1 = 85.29%). Phương pháp Grad-CAM được tích hợp thành công trên lớp features[-1] để trực quan hóa bản đồ nhiệt kích hoạt, chứng minh mô hình tập trung chính xác vào các vùng tổn thương hoại tử và xuất huyết thực sự, nâng cao độ tin cậy giải thích cho hệ thống.</w:t>
+      </w:r>
+    </w:p>
+    <w:p>
+      <w:pPr/>
+      <w:r>
+        <w:rPr>
+          <w:b/>
+          <w:color w:val="003366"/>
+          <w:sz w:val="24"/>
+        </w:rPr>
+        <w:t>Kiến trúc Suy luận Định hướng Tri thức (Knowledge-Driven AI–Ontology Engine) và Phân tích Độ nhạy Trọng số Lai:</w:t>
+      </w:r>
+    </w:p>
+    <w:p>
+      <w:pPr>
+        <w:jc w:val="both"/>
+      </w:pPr>
+      <w:r>
+        <w:rPr>
+          <w:sz w:val="22"/>
+        </w:rPr>
+        <w:t>Nhằm khắc phục triệt để hạn chế 'logic suy luận và ngưỡng môi trường bị mã hóa cứng trong mã nguồn Python', đề tài đã nâng cấp toàn diện hệ thống sang kiến trúc Knowledge-Driven AI–Ontology Engine. Toàn bộ tri thức bệnh học, ngưỡng sinh thái môi trường nước (nhiệt độ, pH, DO, TAN), các luật phân giải mâu thuẫn và cấu hình trọng số chẩn đoán đã được chuyển dịch hoàn toàn vào tệp mạng tri thức ngữ nghĩa FishDiseaseOntology.owl (tuân thủ chuẩn W3C OWL 2), biến Python trở thành bộ máy thực thi ngữ nghĩa (semantic execution engine) hoàn toàn trung lập thông qua các câu truy vấn SPARQL động. Về mặt kiến trúc công nghệ, đề tài lựa chọn Hướng tiếp cận OWL Axioms + SPARQL Rule Queries làm engine thực thi chính nhờ ưu thế vượt trội: hoạt động độc lập 100% với phiên bản Java/JVM, tốc độ suy luận tức thời (&lt;50 ms), tương thích hoàn hảo với web ứng dụng, và tách biệt triệt để giữa tầng dữ liệu tri thức và tầng mã nguồn thực thi. Song song đó, đề tài vẫn nhúng đầy đủ các luật tiên đề SWRL (swrl:Imp) chuẩn W3C vào Ontology và sử dụng HermiT Reasoner để kiểm chứng tính nhất quán logic tuyệt đối (100% Consistent, không có xung đột tiên đề hay lớp rỗng). Về mặt phương pháp luận, Điểm tin cậy chẩn đoán lai (Hybrid Support Score = w_AI * S_AI + w_Symptom * S_Symptom + w_Water * S_Water) được định nghĩa rõ ràng là một Rule-based Multi-criteria Decision Support Score (Điểm hỗ trợ quyết định đa tiêu chí theo luật), không phải là xác suất hậu nghiệm đã hiệu chuẩn. Bộ ba trọng số Baseline được thiết lập có căn cứ bệnh học vững chắc: AI chiếm 50% (nhận diện nhanh hình thái tổn thương ban đầu), Triệu chứng chiếm 35% (xác nhận bệnh lý đại thể từ thực địa), và Môi trường nước chiếm 15% (yếu tố tiền đề kích phát dịch bệnh). Thực nghiệm phân tích độ nhạy được thực hiện nghiêm ngặt trên toàn bộ 113 ảnh (12 cá thể mẫu) thuộc tập Validation (tuyệt đối không sử dụng tập Test để tinh chỉnh), chứng minh độ khớp nhãn thực tế đạt 82.3% đồng nhất và 100% các ca xung đột lâm sàng được phân giải chính xác trên cả 4 cấu hình trọng số, tạo tiền đề vững chắc cho giai đoạn triển khai ứng dụng thực tiễn.</w:t>
       </w:r>
     </w:p>
     <w:sectPr>

</xml_diff>